<commit_message>
Versión inicial en rama dev: conversor OPUS → WAV funcionando con Express, Multer y frontend HTML
</commit_message>
<xml_diff>
--- a/🎯 Workflow Document conver opus-wav.docx
+++ b/🎯 Workflow Document conver opus-wav.docx
@@ -63,7 +63,7 @@
     <w:p>
       <w:r>
         <w:pict w14:anchorId="16475A26">
-          <v:rect id="_x0000_i1067" style="width:0;height:1.5pt" o:hralign="center" o:hrstd="t" o:hr="t" fillcolor="#a0a0a0" stroked="f"/>
+          <v:rect id="_x0000_i1025" style="width:0;height:1.5pt" o:hralign="center" o:hrstd="t" o:hr="t" fillcolor="#a0a0a0" stroked="f"/>
         </w:pict>
       </w:r>
     </w:p>
@@ -577,7 +577,7 @@
     <w:p>
       <w:r>
         <w:pict w14:anchorId="4A5A2943">
-          <v:rect id="_x0000_i1068" style="width:0;height:1.5pt" o:hralign="center" o:hrstd="t" o:hr="t" fillcolor="#a0a0a0" stroked="f"/>
+          <v:rect id="_x0000_i1026" style="width:0;height:1.5pt" o:hralign="center" o:hrstd="t" o:hr="t" fillcolor="#a0a0a0" stroked="f"/>
         </w:pict>
       </w:r>
     </w:p>
@@ -761,7 +761,7 @@
     <w:p>
       <w:r>
         <w:pict w14:anchorId="7FEDD7C9">
-          <v:rect id="_x0000_i1069" style="width:0;height:1.5pt" o:hralign="center" o:hrstd="t" o:hr="t" fillcolor="#a0a0a0" stroked="f"/>
+          <v:rect id="_x0000_i1027" style="width:0;height:1.5pt" o:hralign="center" o:hrstd="t" o:hr="t" fillcolor="#a0a0a0" stroked="f"/>
         </w:pict>
       </w:r>
     </w:p>
@@ -896,7 +896,7 @@
     <w:p>
       <w:r>
         <w:pict w14:anchorId="627C422A">
-          <v:rect id="_x0000_i1070" style="width:0;height:1.5pt" o:hralign="center" o:hrstd="t" o:hr="t" fillcolor="#a0a0a0" stroked="f"/>
+          <v:rect id="_x0000_i1028" style="width:0;height:1.5pt" o:hralign="center" o:hrstd="t" o:hr="t" fillcolor="#a0a0a0" stroked="f"/>
         </w:pict>
       </w:r>
     </w:p>
@@ -949,7 +949,7 @@
     <w:p>
       <w:r>
         <w:pict w14:anchorId="540320BF">
-          <v:rect id="_x0000_i1071" style="width:0;height:1.5pt" o:hralign="center" o:hrstd="t" o:hr="t" fillcolor="#a0a0a0" stroked="f"/>
+          <v:rect id="_x0000_i1029" style="width:0;height:1.5pt" o:hralign="center" o:hrstd="t" o:hr="t" fillcolor="#a0a0a0" stroked="f"/>
         </w:pict>
       </w:r>
     </w:p>
@@ -1034,7 +1034,7 @@
     <w:p>
       <w:r>
         <w:pict w14:anchorId="170C10E9">
-          <v:rect id="_x0000_i1072" style="width:0;height:1.5pt" o:hralign="center" o:hrstd="t" o:hr="t" fillcolor="#a0a0a0" stroked="f"/>
+          <v:rect id="_x0000_i1030" style="width:0;height:1.5pt" o:hralign="center" o:hrstd="t" o:hr="t" fillcolor="#a0a0a0" stroked="f"/>
         </w:pict>
       </w:r>
     </w:p>
@@ -1097,11 +1097,16 @@
     <w:p>
       <w:r>
         <w:pict w14:anchorId="44F18619">
-          <v:rect id="_x0000_i1073" style="width:0;height:1.5pt" o:hralign="center" o:hrstd="t" o:hr="t" fillcolor="#a0a0a0" stroked="f"/>
+          <v:rect id="_x0000_i1031" style="width:0;height:1.5pt" o:hralign="center" o:hrstd="t" o:hr="t" fillcolor="#a0a0a0" stroked="f"/>
         </w:pict>
       </w:r>
     </w:p>
     <w:p>
+      <w:pPr>
+        <w:rPr>
+          <w:u w:val="single"/>
+        </w:rPr>
+      </w:pPr>
       <w:r>
         <w:rPr>
           <w:rFonts w:ascii="Segoe UI Emoji" w:hAnsi="Segoe UI Emoji" w:cs="Segoe UI Emoji"/>
@@ -1119,6 +1124,54 @@
         <w:t>Done.</w:t>
       </w:r>
     </w:p>
+    <w:p/>
+    <w:p>
+      <w:r>
+        <w:drawing>
+          <wp:inline distT="0" distB="0" distL="0" distR="0" wp14:anchorId="3D98E36E" wp14:editId="23D0014D">
+            <wp:extent cx="5612130" cy="1412875"/>
+            <wp:effectExtent l="0" t="0" r="7620" b="0"/>
+            <wp:docPr id="1596952562" name="Imagen 1" descr="Diagrama&#10;&#10;El contenido generado por IA puede ser incorrecto."/>
+            <wp:cNvGraphicFramePr>
+              <a:graphicFrameLocks xmlns:a="http://schemas.openxmlformats.org/drawingml/2006/main" noChangeAspect="1"/>
+            </wp:cNvGraphicFramePr>
+            <a:graphic xmlns:a="http://schemas.openxmlformats.org/drawingml/2006/main">
+              <a:graphicData uri="http://schemas.openxmlformats.org/drawingml/2006/picture">
+                <pic:pic xmlns:pic="http://schemas.openxmlformats.org/drawingml/2006/picture">
+                  <pic:nvPicPr>
+                    <pic:cNvPr id="1596952562" name="Imagen 1" descr="Diagrama&#10;&#10;El contenido generado por IA puede ser incorrecto."/>
+                    <pic:cNvPicPr/>
+                  </pic:nvPicPr>
+                  <pic:blipFill>
+                    <a:blip r:embed="rId5"/>
+                    <a:stretch>
+                      <a:fillRect/>
+                    </a:stretch>
+                  </pic:blipFill>
+                  <pic:spPr>
+                    <a:xfrm>
+                      <a:off x="0" y="0"/>
+                      <a:ext cx="5612130" cy="1412875"/>
+                    </a:xfrm>
+                    <a:prstGeom prst="rect">
+                      <a:avLst/>
+                    </a:prstGeom>
+                  </pic:spPr>
+                </pic:pic>
+              </a:graphicData>
+            </a:graphic>
+          </wp:inline>
+        </w:drawing>
+      </w:r>
+    </w:p>
+    <w:p/>
+    <w:p/>
+    <w:p/>
+    <w:p/>
+    <w:p/>
+    <w:p/>
+    <w:p/>
+    <w:p/>
     <w:p/>
     <w:sectPr>
       <w:pgSz w:w="12240" w:h="15840"/>
@@ -2854,6 +2907,7 @@
   <w:style w:type="character" w:default="1" w:styleId="Fuentedeprrafopredeter">
     <w:name w:val="Default Paragraph Font"/>
     <w:uiPriority w:val="1"/>
+    <w:semiHidden/>
     <w:unhideWhenUsed/>
   </w:style>
   <w:style w:type="table" w:default="1" w:styleId="Tablanormal">

</xml_diff>